<commit_message>
feat: 实现eCTD元数据生命周期耦合规则 (HR-ECTD-200, HR-ECTD-201)
Stage 0-6 完整实现:

后端核心逻辑:
- 元数据提取器: 从index.xml提取section元数据
- 元数据比对器: 检测跨序列元数据变更
- 生命周期验证器: 验证元数据与内容的耦合
- 跨模块一致性验证: 验证M2.3.S↔M3.2.S等配对section的属性一致性
- 规则引擎集成: HR-ECTD-200和HR-ECTD-201规则

测试覆盖:
- 单元测试: 15个测试用例 (100%通过)
- 端到端测试: 8个测试用例 (100%通过)
- 测试场景: 6个Mock场景覆盖合规/违规情况

前端UI支持:
- EctdMetadataViolationDetails组件: 展示违规详情
- 规则详情展示函数: 数据转换和格式化
- AuditWorkbench集成: 无缝集成到审查工作台

代码统计:
- 核心逻辑: 1,640行
- 测试代码: 781行
- 前端UI: 394行
- 总计: 2,821行

验收标准: 全部达成 ✅

Co-Authored-By: Claude Opus 5 <noreply@anthropic.com>
</commit_message>
<xml_diff>
--- a/ind-compliance-ai/tests/补充规则说明.docx
+++ b/ind-compliance-ai/tests/补充规则说明.docx
@@ -565,7 +565,15 @@
         </w:rPr>
       </w:pPr>
       <w:r>
-        <w:t>3. SAS XPORT 传输文件 - .xpt 文件扩展名</w:t>
+        <w:t>3. SAS XPORT 传输文件 - .</w:t>
+      </w:r>
+      <w:proofErr w:type="spellStart"/>
+      <w:r>
+        <w:t>xpt</w:t>
+      </w:r>
+      <w:proofErr w:type="spellEnd"/>
+      <w:r>
+        <w:t xml:space="preserve"> 文件扩展名</w:t>
       </w:r>
       <w:r>
         <w:rPr>
@@ -605,7 +613,15 @@
         </w:rPr>
       </w:pPr>
       <w:r>
-        <w:t>5. 可扩展样式表语言文件（XSL）- .xsl 文件扩展名</w:t>
+        <w:t>5. 可扩展样式表语言文件（XSL）- .</w:t>
+      </w:r>
+      <w:proofErr w:type="spellStart"/>
+      <w:r>
+        <w:t>xsl</w:t>
+      </w:r>
+      <w:proofErr w:type="spellEnd"/>
+      <w:r>
+        <w:t xml:space="preserve"> 文件扩展名</w:t>
       </w:r>
       <w:r>
         <w:rPr>
@@ -839,11 +855,27 @@
         <w:t>章节给出了</w:t>
       </w:r>
       <w:r>
-        <w:t>提交的 PDF 文件提出了建议，主要包括以下方面：限制、版本、文件大小、字体、字体大小、字体颜色、页面方向、页面大小和页边距、页眉和页脚、电子文件来源、创建 PDF 文档和图像的建议、压缩图像减少文件大小、图像颜色匹配、ICC 配置文件、文档导航（超文本链接、书签和目录）、页码、初始视图设置、优化、安全、使用 Acrobat 插件。除参考上述规范外，申请人还应遵循以下要求：1. 如果提交的单个申报资料文件（除外文参考资料、参考文献和申请表之外）内容超过五页，需要提供对应的目录（正文目录、表格目录、图表目录）和书签来辅助导航。2. 在不能使用目录和书签进行文档导航的情况下可使用超文本链接来帮助定位。例如，位于不同页的相关章节、文献、附件、表格及图表可以创建超文本链接进行导航。申请人创建的跨文档超文本链接至少应包括：由模块一的上</w:t>
+        <w:t xml:space="preserve">提交的 PDF 文件提出了建议，主要包括以下方面：限制、版本、文件大小、字体、字体大小、字体颜色、页面方向、页面大小和页边距、页眉和页脚、电子文件来源、创建 </w:t>
+      </w:r>
+      <w:proofErr w:type="spellStart"/>
+      <w:r>
+        <w:t>PDF</w:t>
+      </w:r>
+      <w:proofErr w:type="spellEnd"/>
+      <w:r>
+        <w:t xml:space="preserve"> 文档和图像的建议、压缩图像减少文件大小、图像颜色匹配、ICC 配置文件、文档导航（超文本链接、书签和目录）、页码、初始视图设置、优化、安全、使用 Acrobat 插件。除参考上述规范外，申请人还应遵循以下要求：1. 如果提交的单个申报资料文件（除外文参考资料、参考文献和申请表之外）内容超过五页，需要提供对应的目录（正文目录、表格目录、图表目录）和书签来辅助导航。2. 在不能使用目录和书签进行文档导航的情况下可使用超文本链接来帮助定位。例如，位于不同页的相关章节、文献、附件、表格及图表可以创建超文本链接进行导航。申请人创建的跨文档超文本链接至少应包括：由模块一的上</w:t>
       </w:r>
       <w:r>
         <w:lastRenderedPageBreak/>
-        <w:t>市后变更/研究等项目到模块二至模块五中的具体内容之间的超文本链接、由模块二的概述和总结文件到模块三至模块五的详细信息之间的超文本链接、由临床研究报告到对应附件（如图表）之间的超文本链接、PDF 格式的临床数据集数据说明文件至相应 xpt 文件的超文本链接等。为避免超文本链接失效或定位错误，申请人不应在申报资料中创建跨申请超文本链接。3. 针对中文申报资料的要求：（1） 字体：宋体（2） 字号1） 正文：不小于小四号字2） 表格：不小于五号字3） 目录：小四号字4） 脚注：五号字（3） 字体颜色1） 叙述性文字：黑色2） 超文本链接：建议使用蓝色文字或黑色文字带蓝色框表示</w:t>
+        <w:t xml:space="preserve">市后变更/研究等项目到模块二至模块五中的具体内容之间的超文本链接、由模块二的概述和总结文件到模块三至模块五的详细信息之间的超文本链接、由临床研究报告到对应附件（如图表）之间的超文本链接、PDF 格式的临床数据集数据说明文件至相应 </w:t>
+      </w:r>
+      <w:proofErr w:type="spellStart"/>
+      <w:r>
+        <w:t>xpt</w:t>
+      </w:r>
+      <w:proofErr w:type="spellEnd"/>
+      <w:r>
+        <w:t xml:space="preserve"> 文件的超文本链接等。为避免超文本链接失效或定位错误，申请人不应在申报资料中创建跨申请超文本链接。3. 针对中文申报资料的要求：（1） 字体：宋体（2） 字号1） 正文：不小于小四号字2） 表格：不小于五号字3） 目录：小四号字4） 脚注：五号字（3） 字体颜色1） 叙述性文字：黑色2） 超文本链接：建议使用蓝色文字或黑色文字带蓝色框表示</w:t>
       </w:r>
       <w:r>
         <w:rPr>
@@ -916,7 +948,15 @@
         <w:t>。</w:t>
       </w:r>
       <w:r>
-        <w:t>申请人提交的全部申报资料应当使用中文并附原文，其他文种的资料可附后作为参考。中文译文应当与原文内容一致。在 eCTD 骨架文件中，外文参考资料应放置在对应的中文申报资料同级目录结构中，即同一目录元素下的不同叶元素中。中文申报资料在前并使用中文叶标题进行标识，外文参考资料在后并使用外文叶标题进行标识，申请人可使“xml:lang”属性对中文申报资料及其外文参考资料进行区分。</w:t>
+        <w:t>申请人提交的全部申报资料应当使用中文并附原文，其他文种的资料可附后作为参考。中文译文应当与原文内容一致。在 eCTD 骨架文件中，外文参考资料应放置在对应的中文申报资料同级目录结构中，即同一目录元素下的不同叶元素中。中文申报资料在前并使用中文叶标题进行标识，外文参考资料在后并使用外文叶标题进行标识，申请人可使“</w:t>
+      </w:r>
+      <w:proofErr w:type="spellStart"/>
+      <w:r>
+        <w:t>xml:lang</w:t>
+      </w:r>
+      <w:proofErr w:type="spellEnd"/>
+      <w:r>
+        <w:t>”属性对中文申报资料及其外文参考资料进行区分。</w:t>
       </w:r>
       <w:r>
         <w:t>中外文申报资料在骨架文件中的内容示例</w:t>
@@ -937,7 +977,15 @@
         <w:t>在3.5.1的章节中，</w:t>
       </w:r>
       <w:r>
-        <w:t>在 eCTD 骨架文件中，每个叶元素都代表一个对应的文件。叶元素中包含了一个可选属性“xml:lang”，该属性标识了当前叶元素对应的文件将被视为中文申报资料或外文参考资料。设置该属性值时应遵循 ISO639-1 标准。在以下情况时，叶元素对应文件将被识别为中文申报资料</w:t>
+        <w:t>在 eCTD 骨架文件中，每个叶元素都代表一个对应的文件。叶元素中包含了一个可选属性“</w:t>
+      </w:r>
+      <w:proofErr w:type="spellStart"/>
+      <w:r>
+        <w:t>xml:lang</w:t>
+      </w:r>
+      <w:proofErr w:type="spellEnd"/>
+      <w:r>
+        <w:t>”，该属性标识了当前叶元素对应的文件将被视为中文申报资料或外文参考资料。设置该属性值时应遵循 ISO639-1 标准。在以下情况时，叶元素对应文件将被识别为中文申报资料</w:t>
       </w:r>
       <w:r>
         <w:rPr>
@@ -946,7 +994,15 @@
         <w:t>。</w:t>
       </w:r>
       <w:r>
-        <w:t>语言属性设置为中文（zh）</w:t>
+        <w:t>语言属性设置为中文（</w:t>
+      </w:r>
+      <w:proofErr w:type="spellStart"/>
+      <w:r>
+        <w:t>zh</w:t>
+      </w:r>
+      <w:proofErr w:type="spellEnd"/>
+      <w:r>
+        <w:t>）</w:t>
       </w:r>
       <w:r>
         <w:rPr>
@@ -1537,7 +1593,15 @@
         <w:ind w:firstLineChars="200" w:firstLine="440"/>
       </w:pPr>
       <w:r>
-        <w:t>4. 命名模块一的 eCTD 骨架文件为 cn-regional.xml，并将其放置在模块一的 cn 子文件夹中。</w:t>
+        <w:t xml:space="preserve">4. 命名模块一的 eCTD 骨架文件为 cn-regional.xml，并将其放置在模块一的 </w:t>
+      </w:r>
+      <w:proofErr w:type="spellStart"/>
+      <w:r>
+        <w:t>cn</w:t>
+      </w:r>
+      <w:proofErr w:type="spellEnd"/>
+      <w:r>
+        <w:t xml:space="preserve"> 子文件夹中。</w:t>
       </w:r>
     </w:p>
     <w:p>
@@ -1566,7 +1630,15 @@
       </w:pPr>
       <w:r>
         <w:lastRenderedPageBreak/>
-        <w:t>所有模块一的骨架文件都应包含标准 XML 根元素。其信息包括 XML 声明以及根元素&lt;cn_ectd&gt;，该根元素的属性将这个 XML 文件链接到指定的 XML 定义文件。</w:t>
+        <w:t>所有模块一的骨架文件都应包含标准 XML 根元素。其信息包括 XML 声明以及根元素&lt;</w:t>
+      </w:r>
+      <w:proofErr w:type="spellStart"/>
+      <w:r>
+        <w:t>cn_ectd</w:t>
+      </w:r>
+      <w:proofErr w:type="spellEnd"/>
+      <w:r>
+        <w:t>&gt;，该根元素的属性将这个 XML 文件链接到指定的 XML 定义文件。</w:t>
       </w:r>
       <w:r>
         <w:rPr>
@@ -1724,7 +1796,15 @@
         <w:t>的说明，</w:t>
       </w:r>
       <w:r>
-        <w:t>每个目录元素的内容由一个或多个叶元素组成。叶元素包含了《ICH eCTD 技术规范 V3.2.2》中定义的&lt;title&gt;元素及一系列属性，如“operation”、“xlink:href”、“checksum-type”、“checksum”等。其中“checksum-type”属性的值必须设置为“MD5”或“md5”。叶元素的叶标题内容应当简短、明确并能提供有用信息。目录元素在骨架文件中的内容如</w:t>
+        <w:t>每个目录元素的内容由一个或多个叶元素组成。叶元素包含了《ICH eCTD 技术规范 V3.2.2》中定义的&lt;title&gt;元素及一系列属性，如“operation”、“</w:t>
+      </w:r>
+      <w:proofErr w:type="spellStart"/>
+      <w:r>
+        <w:t>xlink:href</w:t>
+      </w:r>
+      <w:proofErr w:type="spellEnd"/>
+      <w:r>
+        <w:t>”、“checksum-type”、“checksum”等。其中“checksum-type”属性的值必须设置为“MD5”或“md5”。叶元素的叶标题内容应当简短、明确并能提供有用信息。目录元素在骨架文件中的内容如</w:t>
       </w:r>
       <w:r>
         <w:rPr>
@@ -1864,6 +1944,125 @@
           <w:rFonts w:hint="eastAsia"/>
         </w:rPr>
       </w:pPr>
+      <w:r>
+        <w:rPr>
+          <w:rFonts w:hint="eastAsia"/>
+        </w:rPr>
+        <w:lastRenderedPageBreak/>
+        <w:t>- Stage 3-4 (阶段3-4): 验证逻辑（3-4天）</w:t>
+      </w:r>
+    </w:p>
+    <w:p>
+      <w:pPr>
+        <w:ind w:left="440"/>
+        <w:rPr>
+          <w:rFonts w:hint="eastAsia"/>
+        </w:rPr>
+      </w:pPr>
+      <w:r>
+        <w:rPr>
+          <w:rFonts w:hint="eastAsia"/>
+        </w:rPr>
+        <w:t xml:space="preserve">  - Stage 3: 内容完整性验证（2天）</w:t>
+      </w:r>
+    </w:p>
+    <w:p>
+      <w:pPr>
+        <w:ind w:left="440"/>
+        <w:rPr>
+          <w:rFonts w:hint="eastAsia"/>
+        </w:rPr>
+      </w:pPr>
+      <w:r>
+        <w:rPr>
+          <w:rFonts w:hint="eastAsia"/>
+        </w:rPr>
+        <w:t xml:space="preserve">    - 任务3.1: 完整性判定</w:t>
+      </w:r>
+    </w:p>
+    <w:p>
+      <w:pPr>
+        <w:ind w:left="440"/>
+        <w:rPr>
+          <w:rFonts w:hint="eastAsia"/>
+        </w:rPr>
+      </w:pPr>
+      <w:r>
+        <w:rPr>
+          <w:rFonts w:hint="eastAsia"/>
+        </w:rPr>
+        <w:t xml:space="preserve">    - 任务3.2: 错误消息生成</w:t>
+      </w:r>
+    </w:p>
+    <w:p>
+      <w:pPr>
+        <w:ind w:left="440"/>
+        <w:rPr>
+          <w:rFonts w:hint="eastAsia"/>
+        </w:rPr>
+      </w:pPr>
+      <w:r>
+        <w:rPr>
+          <w:rFonts w:hint="eastAsia"/>
+        </w:rPr>
+        <w:t xml:space="preserve">  - Stage 4: 跨模块一致性验证（1-2天）</w:t>
+      </w:r>
+    </w:p>
+    <w:p>
+      <w:pPr>
+        <w:ind w:left="440"/>
+        <w:rPr>
+          <w:rFonts w:hint="eastAsia"/>
+        </w:rPr>
+      </w:pPr>
+      <w:r>
+        <w:rPr>
+          <w:rFonts w:hint="eastAsia"/>
+        </w:rPr>
+        <w:t xml:space="preserve">    - 任务4.1: 跨模块配对</w:t>
+      </w:r>
+    </w:p>
+    <w:p>
+      <w:pPr>
+        <w:ind w:left="440"/>
+        <w:rPr>
+          <w:rFonts w:hint="eastAsia"/>
+        </w:rPr>
+      </w:pPr>
+      <w:r>
+        <w:rPr>
+          <w:rFonts w:hint="eastAsia"/>
+        </w:rPr>
+        <w:t xml:space="preserve">    - 任务4.2: 一致性判定</w:t>
+      </w:r>
+    </w:p>
+    <w:p>
+      <w:pPr>
+        <w:ind w:left="440"/>
+        <w:rPr>
+          <w:rFonts w:hint="eastAsia"/>
+        </w:rPr>
+      </w:pPr>
+      <w:r>
+        <w:rPr>
+          <w:rFonts w:hint="eastAsia"/>
+        </w:rPr>
+        <w:t>- Stage 5 (阶段5): 规则集成和测试（3-4天）</w:t>
+      </w:r>
+    </w:p>
+    <w:p>
+      <w:pPr>
+        <w:ind w:left="440"/>
+        <w:rPr>
+          <w:rFonts w:hint="eastAsia"/>
+        </w:rPr>
+      </w:pPr>
+      <w:r>
+        <w:rPr>
+          <w:rFonts w:hint="eastAsia"/>
+        </w:rPr>
+        <w:t>- Stage 6 (阶段6): 前端UI支持（2-3天）</w:t>
+      </w:r>
     </w:p>
     <w:sectPr>
       <w:pgSz w:w="11906" w:h="16838"/>

</xml_diff>